<commit_message>
DiplomasWeb v3.0 - Sistema de gestion de diplomas
</commit_message>
<xml_diff>
--- a/templates/diploma_template.docx
+++ b/templates/diploma_template.docx
@@ -47,7 +47,25 @@
           <w:b/>
           <w:bCs/>
         </w:rPr>
-        <w:t xml:space="preserve">Se otorga el título de: {{nombre}} {{apellidos}} </w:t>
+        <w:t>Se otorga el título de</w:t>
+      </w:r>
+      <w:r>
+        <w:rPr>
+          <w:rStyle w:val="CdigoHTML"/>
+          <w:rFonts w:eastAsiaTheme="minorHAnsi"/>
+          <w:b/>
+          <w:bCs/>
+        </w:rPr>
+        <w:t xml:space="preserve"> {{carrera}} al bachiller</w:t>
+      </w:r>
+      <w:r>
+        <w:rPr>
+          <w:rStyle w:val="CdigoHTML"/>
+          <w:rFonts w:eastAsiaTheme="minorHAnsi"/>
+          <w:b/>
+          <w:bCs/>
+        </w:rPr>
+        <w:t xml:space="preserve">: {{nombre}} {{apellidos}} </w:t>
       </w:r>
     </w:p>
     <w:p>
@@ -759,6 +777,7 @@
   <w:style w:type="character" w:default="1" w:styleId="Fuentedeprrafopredeter">
     <w:name w:val="Default Paragraph Font"/>
     <w:uiPriority w:val="1"/>
+    <w:semiHidden/>
     <w:unhideWhenUsed/>
   </w:style>
   <w:style w:type="table" w:default="1" w:styleId="Tablanormal">

</xml_diff>